<commit_message>
qc-data-model.docx: minor formatting fixes
</commit_message>
<xml_diff>
--- a/qc-data-model/qc-data-model.docx
+++ b/qc-data-model/qc-data-model.docx
@@ -5144,11 +5144,11 @@
         <w:tblLook w:val="04A0" w:firstRow="1" w:lastRow="0" w:firstColumn="1" w:lastColumn="0" w:noHBand="0" w:noVBand="1"/>
       </w:tblPr>
       <w:tblGrid>
-        <w:gridCol w:w="1876"/>
-        <w:gridCol w:w="1846"/>
-        <w:gridCol w:w="1351"/>
-        <w:gridCol w:w="3690"/>
-        <w:gridCol w:w="2000"/>
+        <w:gridCol w:w="1980"/>
+        <w:gridCol w:w="1984"/>
+        <w:gridCol w:w="1276"/>
+        <w:gridCol w:w="3551"/>
+        <w:gridCol w:w="1972"/>
       </w:tblGrid>
       <w:tr>
         <w:trPr>
@@ -5157,7 +5157,7 @@
         </w:trPr>
         <w:tc>
           <w:tcPr>
-            <w:tcW w:w="0" w:type="auto"/>
+            <w:tcW w:w="1980" w:type="dxa"/>
           </w:tcPr>
           <w:p>
             <w:pPr>
@@ -5182,7 +5182,7 @@
         </w:tc>
         <w:tc>
           <w:tcPr>
-            <w:tcW w:w="0" w:type="auto"/>
+            <w:tcW w:w="1984" w:type="dxa"/>
           </w:tcPr>
           <w:p>
             <w:pPr>
@@ -5204,7 +5204,7 @@
         </w:tc>
         <w:tc>
           <w:tcPr>
-            <w:tcW w:w="0" w:type="auto"/>
+            <w:tcW w:w="1276" w:type="dxa"/>
           </w:tcPr>
           <w:p>
             <w:pPr>
@@ -5226,7 +5226,7 @@
         </w:tc>
         <w:tc>
           <w:tcPr>
-            <w:tcW w:w="0" w:type="auto"/>
+            <w:tcW w:w="3551" w:type="dxa"/>
           </w:tcPr>
           <w:p>
             <w:pPr>
@@ -5276,7 +5276,7 @@
         </w:trPr>
         <w:tc>
           <w:tcPr>
-            <w:tcW w:w="0" w:type="auto"/>
+            <w:tcW w:w="1980" w:type="dxa"/>
           </w:tcPr>
           <w:p>
             <w:pPr>
@@ -5296,7 +5296,7 @@
         </w:tc>
         <w:tc>
           <w:tcPr>
-            <w:tcW w:w="0" w:type="auto"/>
+            <w:tcW w:w="1984" w:type="dxa"/>
           </w:tcPr>
           <w:p>
             <w:pPr>
@@ -5324,7 +5324,7 @@
         </w:tc>
         <w:tc>
           <w:tcPr>
-            <w:tcW w:w="0" w:type="auto"/>
+            <w:tcW w:w="1276" w:type="dxa"/>
           </w:tcPr>
           <w:p>
             <w:pPr>
@@ -5344,7 +5344,7 @@
         </w:tc>
         <w:tc>
           <w:tcPr>
-            <w:tcW w:w="0" w:type="auto"/>
+            <w:tcW w:w="3551" w:type="dxa"/>
           </w:tcPr>
           <w:p>
             <w:pPr>
@@ -5421,7 +5421,7 @@
         </w:trPr>
         <w:tc>
           <w:tcPr>
-            <w:tcW w:w="0" w:type="auto"/>
+            <w:tcW w:w="1980" w:type="dxa"/>
           </w:tcPr>
           <w:p>
             <w:pPr>
@@ -5443,7 +5443,7 @@
         </w:tc>
         <w:tc>
           <w:tcPr>
-            <w:tcW w:w="0" w:type="auto"/>
+            <w:tcW w:w="1984" w:type="dxa"/>
           </w:tcPr>
           <w:p>
             <w:pPr>
@@ -5471,7 +5471,7 @@
         </w:tc>
         <w:tc>
           <w:tcPr>
-            <w:tcW w:w="0" w:type="auto"/>
+            <w:tcW w:w="1276" w:type="dxa"/>
           </w:tcPr>
           <w:p>
             <w:pPr>
@@ -5491,7 +5491,7 @@
         </w:tc>
         <w:tc>
           <w:tcPr>
-            <w:tcW w:w="0" w:type="auto"/>
+            <w:tcW w:w="3551" w:type="dxa"/>
           </w:tcPr>
           <w:p>
             <w:pPr>
@@ -5553,7 +5553,7 @@
         </w:trPr>
         <w:tc>
           <w:tcPr>
-            <w:tcW w:w="0" w:type="auto"/>
+            <w:tcW w:w="1980" w:type="dxa"/>
           </w:tcPr>
           <w:p>
             <w:pPr>
@@ -5587,7 +5587,7 @@
         </w:tc>
         <w:tc>
           <w:tcPr>
-            <w:tcW w:w="0" w:type="auto"/>
+            <w:tcW w:w="1984" w:type="dxa"/>
           </w:tcPr>
           <w:p>
             <w:pPr>
@@ -5615,7 +5615,7 @@
         </w:tc>
         <w:tc>
           <w:tcPr>
-            <w:tcW w:w="0" w:type="auto"/>
+            <w:tcW w:w="1276" w:type="dxa"/>
           </w:tcPr>
           <w:p>
             <w:pPr>
@@ -5637,7 +5637,7 @@
         </w:tc>
         <w:tc>
           <w:tcPr>
-            <w:tcW w:w="0" w:type="auto"/>
+            <w:tcW w:w="3551" w:type="dxa"/>
           </w:tcPr>
           <w:p>
             <w:pPr>
@@ -5728,7 +5728,7 @@
         </w:trPr>
         <w:tc>
           <w:tcPr>
-            <w:tcW w:w="0" w:type="auto"/>
+            <w:tcW w:w="1980" w:type="dxa"/>
           </w:tcPr>
           <w:p>
             <w:pPr>
@@ -5751,7 +5751,7 @@
         </w:tc>
         <w:tc>
           <w:tcPr>
-            <w:tcW w:w="0" w:type="auto"/>
+            <w:tcW w:w="1984" w:type="dxa"/>
           </w:tcPr>
           <w:p>
             <w:pPr>
@@ -5779,7 +5779,7 @@
         </w:tc>
         <w:tc>
           <w:tcPr>
-            <w:tcW w:w="0" w:type="auto"/>
+            <w:tcW w:w="1276" w:type="dxa"/>
           </w:tcPr>
           <w:p>
             <w:pPr>
@@ -5799,7 +5799,7 @@
         </w:tc>
         <w:tc>
           <w:tcPr>
-            <w:tcW w:w="0" w:type="auto"/>
+            <w:tcW w:w="3551" w:type="dxa"/>
           </w:tcPr>
           <w:p>
             <w:pPr>
@@ -5976,7 +5976,7 @@
         </w:trPr>
         <w:tc>
           <w:tcPr>
-            <w:tcW w:w="0" w:type="auto"/>
+            <w:tcW w:w="1980" w:type="dxa"/>
           </w:tcPr>
           <w:p>
             <w:pPr>
@@ -5996,7 +5996,7 @@
         </w:tc>
         <w:tc>
           <w:tcPr>
-            <w:tcW w:w="0" w:type="auto"/>
+            <w:tcW w:w="1984" w:type="dxa"/>
           </w:tcPr>
           <w:p>
             <w:pPr>
@@ -6048,30 +6048,146 @@
         </w:tc>
         <w:tc>
           <w:tcPr>
+            <w:tcW w:w="1276" w:type="dxa"/>
+          </w:tcPr>
+          <w:p>
+            <w:pPr>
+              <w:rPr>
+                <w:sz w:val="18"/>
+                <w:szCs w:val="18"/>
+              </w:rPr>
+            </w:pPr>
+            <w:r>
+              <w:rPr>
+                <w:sz w:val="18"/>
+                <w:szCs w:val="18"/>
+              </w:rPr>
+              <w:t>1</w:t>
+            </w:r>
+          </w:p>
+        </w:tc>
+        <w:tc>
+          <w:tcPr>
+            <w:tcW w:w="3551" w:type="dxa"/>
+          </w:tcPr>
+          <w:p>
+            <w:pPr>
+              <w:jc w:val="left"/>
+              <w:rPr>
+                <w:sz w:val="18"/>
+                <w:szCs w:val="18"/>
+              </w:rPr>
+            </w:pPr>
+            <w:r>
+              <w:rPr>
+                <w:sz w:val="18"/>
+                <w:szCs w:val="18"/>
+              </w:rPr>
+              <w:t>T</w:t>
+            </w:r>
+            <w:r>
+              <w:rPr>
+                <w:sz w:val="18"/>
+                <w:szCs w:val="18"/>
+              </w:rPr>
+              <w:t>h</w:t>
+            </w:r>
+            <w:r>
+              <w:rPr>
+                <w:sz w:val="18"/>
+                <w:szCs w:val="18"/>
+              </w:rPr>
+              <w:t xml:space="preserve">e </w:t>
+            </w:r>
+            <w:r>
+              <w:rPr>
+                <w:sz w:val="18"/>
+                <w:szCs w:val="18"/>
+              </w:rPr>
+              <w:t>S</w:t>
+            </w:r>
+            <w:r>
+              <w:rPr>
+                <w:sz w:val="18"/>
+                <w:szCs w:val="18"/>
+              </w:rPr>
+              <w:t>tatus s</w:t>
+            </w:r>
+            <w:r>
+              <w:rPr>
+                <w:sz w:val="18"/>
+                <w:szCs w:val="18"/>
+              </w:rPr>
+              <w:t xml:space="preserve">pecifies the progress of the </w:t>
+            </w:r>
+            <w:proofErr w:type="spellStart"/>
+            <w:r>
+              <w:rPr>
+                <w:sz w:val="18"/>
+                <w:szCs w:val="18"/>
+              </w:rPr>
+              <w:t>QC</w:t>
+            </w:r>
+            <w:r>
+              <w:rPr>
+                <w:sz w:val="18"/>
+                <w:szCs w:val="18"/>
+              </w:rPr>
+              <w:t>I</w:t>
+            </w:r>
+            <w:r>
+              <w:rPr>
+                <w:sz w:val="18"/>
+                <w:szCs w:val="18"/>
+              </w:rPr>
+              <w:t>tem</w:t>
+            </w:r>
+            <w:r>
+              <w:rPr>
+                <w:sz w:val="18"/>
+                <w:szCs w:val="18"/>
+              </w:rPr>
+              <w:t>D</w:t>
+            </w:r>
+            <w:r>
+              <w:rPr>
+                <w:sz w:val="18"/>
+                <w:szCs w:val="18"/>
+              </w:rPr>
+              <w:t>efinition</w:t>
+            </w:r>
+            <w:proofErr w:type="spellEnd"/>
+            <w:r>
+              <w:rPr>
+                <w:sz w:val="18"/>
+                <w:szCs w:val="18"/>
+              </w:rPr>
+              <w:t xml:space="preserve"> by the authors</w:t>
+            </w:r>
+            <w:r>
+              <w:rPr>
+                <w:sz w:val="18"/>
+                <w:szCs w:val="18"/>
+              </w:rPr>
+              <w:t>.</w:t>
+            </w:r>
+          </w:p>
+          <w:p>
+            <w:pPr>
+              <w:jc w:val="left"/>
+              <w:rPr>
+                <w:sz w:val="18"/>
+                <w:szCs w:val="18"/>
+              </w:rPr>
+            </w:pPr>
+          </w:p>
+        </w:tc>
+        <w:tc>
+          <w:tcPr>
             <w:tcW w:w="0" w:type="auto"/>
           </w:tcPr>
           <w:p>
             <w:pPr>
-              <w:rPr>
-                <w:sz w:val="18"/>
-                <w:szCs w:val="18"/>
-              </w:rPr>
-            </w:pPr>
-            <w:r>
-              <w:rPr>
-                <w:sz w:val="18"/>
-                <w:szCs w:val="18"/>
-              </w:rPr>
-              <w:t>1</w:t>
-            </w:r>
-          </w:p>
-        </w:tc>
-        <w:tc>
-          <w:tcPr>
-            <w:tcW w:w="0" w:type="auto"/>
-          </w:tcPr>
-          <w:p>
-            <w:pPr>
               <w:jc w:val="left"/>
               <w:rPr>
                 <w:sz w:val="18"/>
@@ -6083,126 +6199,12 @@
                 <w:sz w:val="18"/>
                 <w:szCs w:val="18"/>
               </w:rPr>
-              <w:t>T</w:t>
-            </w:r>
-            <w:r>
-              <w:rPr>
-                <w:sz w:val="18"/>
-                <w:szCs w:val="18"/>
-              </w:rPr>
-              <w:t>h</w:t>
-            </w:r>
-            <w:r>
-              <w:rPr>
-                <w:sz w:val="18"/>
-                <w:szCs w:val="18"/>
-              </w:rPr>
-              <w:t xml:space="preserve">e </w:t>
-            </w:r>
-            <w:r>
-              <w:rPr>
-                <w:sz w:val="18"/>
-                <w:szCs w:val="18"/>
-              </w:rPr>
-              <w:t>S</w:t>
-            </w:r>
-            <w:r>
-              <w:rPr>
-                <w:sz w:val="18"/>
-                <w:szCs w:val="18"/>
-              </w:rPr>
-              <w:t>tatus s</w:t>
-            </w:r>
-            <w:r>
-              <w:rPr>
-                <w:sz w:val="18"/>
-                <w:szCs w:val="18"/>
-              </w:rPr>
-              <w:t xml:space="preserve">pecifies the progress of the </w:t>
-            </w:r>
-            <w:proofErr w:type="spellStart"/>
-            <w:r>
-              <w:rPr>
-                <w:sz w:val="18"/>
-                <w:szCs w:val="18"/>
-              </w:rPr>
-              <w:t>QC</w:t>
-            </w:r>
-            <w:r>
-              <w:rPr>
-                <w:sz w:val="18"/>
-                <w:szCs w:val="18"/>
-              </w:rPr>
-              <w:t>I</w:t>
-            </w:r>
-            <w:r>
-              <w:rPr>
-                <w:sz w:val="18"/>
-                <w:szCs w:val="18"/>
-              </w:rPr>
-              <w:t>tem</w:t>
-            </w:r>
-            <w:r>
-              <w:rPr>
-                <w:sz w:val="18"/>
-                <w:szCs w:val="18"/>
-              </w:rPr>
-              <w:t>D</w:t>
-            </w:r>
-            <w:r>
-              <w:rPr>
-                <w:sz w:val="18"/>
-                <w:szCs w:val="18"/>
-              </w:rPr>
-              <w:t>efinition</w:t>
-            </w:r>
-            <w:proofErr w:type="spellEnd"/>
-            <w:r>
-              <w:rPr>
-                <w:sz w:val="18"/>
-                <w:szCs w:val="18"/>
-              </w:rPr>
-              <w:t xml:space="preserve"> by the authors</w:t>
-            </w:r>
-            <w:r>
-              <w:rPr>
-                <w:sz w:val="18"/>
-                <w:szCs w:val="18"/>
-              </w:rPr>
-              <w:t>.</w:t>
+              <w:t>published</w:t>
             </w:r>
           </w:p>
           <w:p>
             <w:pPr>
               <w:jc w:val="left"/>
-              <w:rPr>
-                <w:sz w:val="18"/>
-                <w:szCs w:val="18"/>
-              </w:rPr>
-            </w:pPr>
-          </w:p>
-        </w:tc>
-        <w:tc>
-          <w:tcPr>
-            <w:tcW w:w="0" w:type="auto"/>
-          </w:tcPr>
-          <w:p>
-            <w:pPr>
-              <w:rPr>
-                <w:sz w:val="18"/>
-                <w:szCs w:val="18"/>
-              </w:rPr>
-            </w:pPr>
-            <w:r>
-              <w:rPr>
-                <w:sz w:val="18"/>
-                <w:szCs w:val="18"/>
-              </w:rPr>
-              <w:t>published</w:t>
-            </w:r>
-          </w:p>
-          <w:p>
-            <w:pPr>
               <w:rPr>
                 <w:sz w:val="18"/>
                 <w:szCs w:val="18"/>
@@ -6246,7 +6248,7 @@
         </w:trPr>
         <w:tc>
           <w:tcPr>
-            <w:tcW w:w="0" w:type="auto"/>
+            <w:tcW w:w="1980" w:type="dxa"/>
           </w:tcPr>
           <w:p>
             <w:pPr>
@@ -6268,7 +6270,7 @@
         </w:tc>
         <w:tc>
           <w:tcPr>
-            <w:tcW w:w="0" w:type="auto"/>
+            <w:tcW w:w="1984" w:type="dxa"/>
           </w:tcPr>
           <w:p>
             <w:pPr>
@@ -6334,30 +6336,153 @@
         </w:tc>
         <w:tc>
           <w:tcPr>
+            <w:tcW w:w="1276" w:type="dxa"/>
+          </w:tcPr>
+          <w:p>
+            <w:pPr>
+              <w:rPr>
+                <w:sz w:val="18"/>
+                <w:szCs w:val="18"/>
+              </w:rPr>
+            </w:pPr>
+            <w:r>
+              <w:rPr>
+                <w:sz w:val="18"/>
+                <w:szCs w:val="18"/>
+              </w:rPr>
+              <w:t>1</w:t>
+            </w:r>
+          </w:p>
+        </w:tc>
+        <w:tc>
+          <w:tcPr>
+            <w:tcW w:w="3551" w:type="dxa"/>
+          </w:tcPr>
+          <w:p>
+            <w:pPr>
+              <w:jc w:val="left"/>
+              <w:rPr>
+                <w:sz w:val="18"/>
+                <w:szCs w:val="18"/>
+              </w:rPr>
+            </w:pPr>
+            <w:r>
+              <w:rPr>
+                <w:sz w:val="18"/>
+                <w:szCs w:val="18"/>
+              </w:rPr>
+              <w:t xml:space="preserve">Specifies whether the </w:t>
+            </w:r>
+            <w:r>
+              <w:rPr>
+                <w:sz w:val="18"/>
+                <w:szCs w:val="18"/>
+              </w:rPr>
+              <w:t>Test</w:t>
+            </w:r>
+            <w:r>
+              <w:rPr>
+                <w:sz w:val="18"/>
+                <w:szCs w:val="18"/>
+              </w:rPr>
+              <w:t xml:space="preserve"> can be used as a </w:t>
+            </w:r>
+            <w:r>
+              <w:rPr>
+                <w:i/>
+                <w:sz w:val="18"/>
+              </w:rPr>
+              <w:t>c</w:t>
+            </w:r>
+            <w:r>
+              <w:rPr>
+                <w:i/>
+                <w:sz w:val="18"/>
+              </w:rPr>
+              <w:t>heck</w:t>
+            </w:r>
+            <w:r>
+              <w:rPr>
+                <w:sz w:val="18"/>
+                <w:szCs w:val="18"/>
+              </w:rPr>
+              <w:t xml:space="preserve">, as a </w:t>
+            </w:r>
+            <w:r>
+              <w:rPr>
+                <w:i/>
+                <w:sz w:val="18"/>
+              </w:rPr>
+              <w:t>r</w:t>
+            </w:r>
+            <w:r>
+              <w:rPr>
+                <w:i/>
+                <w:sz w:val="18"/>
+              </w:rPr>
+              <w:t>eport</w:t>
+            </w:r>
+            <w:r>
+              <w:rPr>
+                <w:sz w:val="18"/>
+                <w:szCs w:val="18"/>
+              </w:rPr>
+              <w:t xml:space="preserve"> or both.</w:t>
+            </w:r>
+            <w:r>
+              <w:rPr>
+                <w:sz w:val="18"/>
+                <w:szCs w:val="18"/>
+              </w:rPr>
+              <w:t xml:space="preserve"> </w:t>
+            </w:r>
+            <w:r>
+              <w:rPr>
+                <w:sz w:val="18"/>
+                <w:szCs w:val="18"/>
+              </w:rPr>
+              <w:t xml:space="preserve">This attribute is related to the </w:t>
+            </w:r>
+            <w:proofErr w:type="spellStart"/>
+            <w:r>
+              <w:rPr>
+                <w:sz w:val="18"/>
+                <w:szCs w:val="18"/>
+              </w:rPr>
+              <w:t>UsedAs</w:t>
+            </w:r>
+            <w:proofErr w:type="spellEnd"/>
+            <w:r>
+              <w:rPr>
+                <w:sz w:val="18"/>
+                <w:szCs w:val="18"/>
+              </w:rPr>
+              <w:t xml:space="preserve"> attribute of the </w:t>
+            </w:r>
+            <w:proofErr w:type="spellStart"/>
+            <w:r>
+              <w:rPr>
+                <w:sz w:val="18"/>
+                <w:szCs w:val="18"/>
+              </w:rPr>
+              <w:t>QCItem</w:t>
+            </w:r>
+            <w:proofErr w:type="spellEnd"/>
+            <w:r>
+              <w:rPr>
+                <w:sz w:val="18"/>
+                <w:szCs w:val="18"/>
+              </w:rPr>
+              <w:t xml:space="preserve"> entity which specifies the actually used modality.</w:t>
+            </w:r>
+          </w:p>
+        </w:tc>
+        <w:tc>
+          <w:tcPr>
             <w:tcW w:w="0" w:type="auto"/>
           </w:tcPr>
           <w:p>
             <w:pPr>
-              <w:rPr>
-                <w:sz w:val="18"/>
-                <w:szCs w:val="18"/>
-              </w:rPr>
-            </w:pPr>
-            <w:r>
-              <w:rPr>
-                <w:sz w:val="18"/>
-                <w:szCs w:val="18"/>
-              </w:rPr>
-              <w:t>1</w:t>
-            </w:r>
-          </w:p>
-        </w:tc>
-        <w:tc>
-          <w:tcPr>
-            <w:tcW w:w="0" w:type="auto"/>
-          </w:tcPr>
-          <w:p>
-            <w:pPr>
               <w:jc w:val="left"/>
               <w:rPr>
                 <w:sz w:val="18"/>
@@ -6369,154 +6494,33 @@
                 <w:sz w:val="18"/>
                 <w:szCs w:val="18"/>
               </w:rPr>
-              <w:t xml:space="preserve">Specifies whether the </w:t>
-            </w:r>
-            <w:r>
-              <w:rPr>
-                <w:sz w:val="18"/>
-                <w:szCs w:val="18"/>
-              </w:rPr>
-              <w:t>Test</w:t>
-            </w:r>
-            <w:r>
-              <w:rPr>
-                <w:sz w:val="18"/>
-                <w:szCs w:val="18"/>
-              </w:rPr>
-              <w:t xml:space="preserve"> can be used as a </w:t>
-            </w:r>
-            <w:r>
-              <w:rPr>
-                <w:i/>
-                <w:sz w:val="18"/>
-              </w:rPr>
               <w:t>c</w:t>
             </w:r>
             <w:r>
               <w:rPr>
-                <w:i/>
-                <w:sz w:val="18"/>
-              </w:rPr>
-              <w:t>heck</w:t>
-            </w:r>
-            <w:r>
-              <w:rPr>
-                <w:sz w:val="18"/>
-                <w:szCs w:val="18"/>
-              </w:rPr>
-              <w:t xml:space="preserve">, as a </w:t>
-            </w:r>
-            <w:r>
-              <w:rPr>
-                <w:i/>
-                <w:sz w:val="18"/>
+                <w:sz w:val="18"/>
+                <w:szCs w:val="18"/>
+              </w:rPr>
+              <w:t xml:space="preserve">heck </w:t>
+            </w:r>
+            <w:r>
+              <w:rPr>
+                <w:sz w:val="18"/>
+                <w:szCs w:val="18"/>
               </w:rPr>
               <w:t>r</w:t>
             </w:r>
             <w:r>
               <w:rPr>
-                <w:i/>
-                <w:sz w:val="18"/>
+                <w:sz w:val="18"/>
+                <w:szCs w:val="18"/>
               </w:rPr>
               <w:t>eport</w:t>
             </w:r>
-            <w:r>
-              <w:rPr>
-                <w:sz w:val="18"/>
-                <w:szCs w:val="18"/>
-              </w:rPr>
-              <w:t xml:space="preserve"> or both.</w:t>
-            </w:r>
-            <w:r>
-              <w:rPr>
-                <w:sz w:val="18"/>
-                <w:szCs w:val="18"/>
-              </w:rPr>
-              <w:t xml:space="preserve"> </w:t>
-            </w:r>
-            <w:r>
-              <w:rPr>
-                <w:sz w:val="18"/>
-                <w:szCs w:val="18"/>
-              </w:rPr>
-              <w:t xml:space="preserve">This attribute is related to the </w:t>
-            </w:r>
-            <w:proofErr w:type="spellStart"/>
-            <w:r>
-              <w:rPr>
-                <w:sz w:val="18"/>
-                <w:szCs w:val="18"/>
-              </w:rPr>
-              <w:t>UsedAs</w:t>
-            </w:r>
-            <w:proofErr w:type="spellEnd"/>
-            <w:r>
-              <w:rPr>
-                <w:sz w:val="18"/>
-                <w:szCs w:val="18"/>
-              </w:rPr>
-              <w:t xml:space="preserve"> attribute of the </w:t>
-            </w:r>
-            <w:proofErr w:type="spellStart"/>
-            <w:r>
-              <w:rPr>
-                <w:sz w:val="18"/>
-                <w:szCs w:val="18"/>
-              </w:rPr>
-              <w:t>QCItem</w:t>
-            </w:r>
-            <w:proofErr w:type="spellEnd"/>
-            <w:r>
-              <w:rPr>
-                <w:sz w:val="18"/>
-                <w:szCs w:val="18"/>
-              </w:rPr>
-              <w:t xml:space="preserve"> entity which specifies the actually used modality.</w:t>
-            </w:r>
-          </w:p>
-        </w:tc>
-        <w:tc>
-          <w:tcPr>
-            <w:tcW w:w="0" w:type="auto"/>
-          </w:tcPr>
-          <w:p>
-            <w:pPr>
-              <w:rPr>
-                <w:sz w:val="18"/>
-                <w:szCs w:val="18"/>
-              </w:rPr>
-            </w:pPr>
-            <w:r>
-              <w:rPr>
-                <w:sz w:val="18"/>
-                <w:szCs w:val="18"/>
-              </w:rPr>
-              <w:t>c</w:t>
-            </w:r>
-            <w:r>
-              <w:rPr>
-                <w:sz w:val="18"/>
-                <w:szCs w:val="18"/>
-              </w:rPr>
-              <w:t xml:space="preserve">heck </w:t>
-            </w:r>
-            <w:r>
-              <w:rPr>
-                <w:sz w:val="18"/>
-                <w:szCs w:val="18"/>
-              </w:rPr>
-              <w:t>r</w:t>
-            </w:r>
-            <w:r>
-              <w:rPr>
-                <w:sz w:val="18"/>
-                <w:szCs w:val="18"/>
-              </w:rPr>
-              <w:t>eport</w:t>
-            </w:r>
-          </w:p>
-          <w:p>
-            <w:pPr>
+          </w:p>
+          <w:p>
+            <w:pPr>
+              <w:jc w:val="left"/>
               <w:rPr>
                 <w:sz w:val="18"/>
                 <w:szCs w:val="18"/>
@@ -6553,7 +6557,7 @@
         </w:trPr>
         <w:tc>
           <w:tcPr>
-            <w:tcW w:w="0" w:type="auto"/>
+            <w:tcW w:w="1980" w:type="dxa"/>
           </w:tcPr>
           <w:p>
             <w:pPr>
@@ -6574,7 +6578,7 @@
         </w:tc>
         <w:tc>
           <w:tcPr>
-            <w:tcW w:w="0" w:type="auto"/>
+            <w:tcW w:w="1984" w:type="dxa"/>
           </w:tcPr>
           <w:p>
             <w:pPr>
@@ -6602,7 +6606,7 @@
         </w:tc>
         <w:tc>
           <w:tcPr>
-            <w:tcW w:w="0" w:type="auto"/>
+            <w:tcW w:w="1276" w:type="dxa"/>
           </w:tcPr>
           <w:p>
             <w:pPr>
@@ -6622,7 +6626,7 @@
         </w:tc>
         <w:tc>
           <w:tcPr>
-            <w:tcW w:w="0" w:type="auto"/>
+            <w:tcW w:w="3551" w:type="dxa"/>
           </w:tcPr>
           <w:p>
             <w:pPr>
@@ -6722,7 +6726,7 @@
         </w:trPr>
         <w:tc>
           <w:tcPr>
-            <w:tcW w:w="0" w:type="auto"/>
+            <w:tcW w:w="1980" w:type="dxa"/>
           </w:tcPr>
           <w:p>
             <w:pPr>
@@ -6744,7 +6748,7 @@
         </w:tc>
         <w:tc>
           <w:tcPr>
-            <w:tcW w:w="0" w:type="auto"/>
+            <w:tcW w:w="1984" w:type="dxa"/>
           </w:tcPr>
           <w:p>
             <w:pPr>
@@ -6765,7 +6769,7 @@
         </w:tc>
         <w:tc>
           <w:tcPr>
-            <w:tcW w:w="0" w:type="auto"/>
+            <w:tcW w:w="1276" w:type="dxa"/>
           </w:tcPr>
           <w:p>
             <w:pPr>
@@ -6809,7 +6813,7 @@
         </w:tc>
         <w:tc>
           <w:tcPr>
-            <w:tcW w:w="0" w:type="auto"/>
+            <w:tcW w:w="3551" w:type="dxa"/>
           </w:tcPr>
           <w:p>
             <w:pPr>
@@ -6924,7 +6928,7 @@
         </w:trPr>
         <w:tc>
           <w:tcPr>
-            <w:tcW w:w="0" w:type="auto"/>
+            <w:tcW w:w="1980" w:type="dxa"/>
           </w:tcPr>
           <w:p>
             <w:pPr>
@@ -6944,7 +6948,7 @@
         </w:tc>
         <w:tc>
           <w:tcPr>
-            <w:tcW w:w="0" w:type="auto"/>
+            <w:tcW w:w="1984" w:type="dxa"/>
           </w:tcPr>
           <w:p>
             <w:pPr>
@@ -6972,7 +6976,7 @@
         </w:tc>
         <w:tc>
           <w:tcPr>
-            <w:tcW w:w="0" w:type="auto"/>
+            <w:tcW w:w="1276" w:type="dxa"/>
           </w:tcPr>
           <w:p>
             <w:pPr>
@@ -6992,7 +6996,7 @@
         </w:tc>
         <w:tc>
           <w:tcPr>
-            <w:tcW w:w="0" w:type="auto"/>
+            <w:tcW w:w="3551" w:type="dxa"/>
           </w:tcPr>
           <w:p>
             <w:pPr>
@@ -7104,7 +7108,7 @@
         </w:trPr>
         <w:tc>
           <w:tcPr>
-            <w:tcW w:w="0" w:type="auto"/>
+            <w:tcW w:w="1980" w:type="dxa"/>
           </w:tcPr>
           <w:p>
             <w:pPr>
@@ -7133,7 +7137,7 @@
         </w:tc>
         <w:tc>
           <w:tcPr>
-            <w:tcW w:w="0" w:type="auto"/>
+            <w:tcW w:w="1984" w:type="dxa"/>
           </w:tcPr>
           <w:p>
             <w:pPr>
@@ -7185,7 +7189,7 @@
         </w:tc>
         <w:tc>
           <w:tcPr>
-            <w:tcW w:w="0" w:type="auto"/>
+            <w:tcW w:w="1276" w:type="dxa"/>
           </w:tcPr>
           <w:p>
             <w:pPr>
@@ -7205,7 +7209,7 @@
         </w:tc>
         <w:tc>
           <w:tcPr>
-            <w:tcW w:w="0" w:type="auto"/>
+            <w:tcW w:w="3551" w:type="dxa"/>
           </w:tcPr>
           <w:p>
             <w:pPr>
@@ -7485,7 +7489,7 @@
         </w:trPr>
         <w:tc>
           <w:tcPr>
-            <w:tcW w:w="0" w:type="auto"/>
+            <w:tcW w:w="1980" w:type="dxa"/>
           </w:tcPr>
           <w:p>
             <w:pPr>
@@ -7505,7 +7509,7 @@
         </w:tc>
         <w:tc>
           <w:tcPr>
-            <w:tcW w:w="0" w:type="auto"/>
+            <w:tcW w:w="1984" w:type="dxa"/>
           </w:tcPr>
           <w:p>
             <w:pPr>
@@ -7557,7 +7561,7 @@
         </w:tc>
         <w:tc>
           <w:tcPr>
-            <w:tcW w:w="0" w:type="auto"/>
+            <w:tcW w:w="1276" w:type="dxa"/>
           </w:tcPr>
           <w:p>
             <w:pPr>
@@ -7577,7 +7581,7 @@
         </w:tc>
         <w:tc>
           <w:tcPr>
-            <w:tcW w:w="0" w:type="auto"/>
+            <w:tcW w:w="3551" w:type="dxa"/>
           </w:tcPr>
           <w:p>
             <w:pPr>
@@ -7676,7 +7680,7 @@
         </w:trPr>
         <w:tc>
           <w:tcPr>
-            <w:tcW w:w="0" w:type="auto"/>
+            <w:tcW w:w="1980" w:type="dxa"/>
           </w:tcPr>
           <w:p>
             <w:pPr>
@@ -7704,7 +7708,7 @@
         </w:tc>
         <w:tc>
           <w:tcPr>
-            <w:tcW w:w="0" w:type="auto"/>
+            <w:tcW w:w="1984" w:type="dxa"/>
           </w:tcPr>
           <w:p>
             <w:pPr>
@@ -7756,7 +7760,7 @@
         </w:tc>
         <w:tc>
           <w:tcPr>
-            <w:tcW w:w="0" w:type="auto"/>
+            <w:tcW w:w="1276" w:type="dxa"/>
           </w:tcPr>
           <w:p>
             <w:pPr>
@@ -7776,7 +7780,7 @@
         </w:tc>
         <w:tc>
           <w:tcPr>
-            <w:tcW w:w="0" w:type="auto"/>
+            <w:tcW w:w="3551" w:type="dxa"/>
           </w:tcPr>
           <w:p>
             <w:pPr>
@@ -7875,7 +7879,7 @@
         </w:trPr>
         <w:tc>
           <w:tcPr>
-            <w:tcW w:w="0" w:type="auto"/>
+            <w:tcW w:w="1980" w:type="dxa"/>
           </w:tcPr>
           <w:p>
             <w:pPr>
@@ -7913,7 +7917,7 @@
         </w:tc>
         <w:tc>
           <w:tcPr>
-            <w:tcW w:w="0" w:type="auto"/>
+            <w:tcW w:w="1984" w:type="dxa"/>
           </w:tcPr>
           <w:p>
             <w:pPr>
@@ -7965,7 +7969,7 @@
         </w:tc>
         <w:tc>
           <w:tcPr>
-            <w:tcW w:w="0" w:type="auto"/>
+            <w:tcW w:w="1276" w:type="dxa"/>
           </w:tcPr>
           <w:p>
             <w:pPr>
@@ -7985,7 +7989,7 @@
         </w:tc>
         <w:tc>
           <w:tcPr>
-            <w:tcW w:w="0" w:type="auto"/>
+            <w:tcW w:w="3551" w:type="dxa"/>
           </w:tcPr>
           <w:p>
             <w:pPr>
@@ -8056,7 +8060,7 @@
         </w:trPr>
         <w:tc>
           <w:tcPr>
-            <w:tcW w:w="0" w:type="auto"/>
+            <w:tcW w:w="1980" w:type="dxa"/>
           </w:tcPr>
           <w:p>
             <w:pPr>
@@ -8090,7 +8094,7 @@
         </w:tc>
         <w:tc>
           <w:tcPr>
-            <w:tcW w:w="0" w:type="auto"/>
+            <w:tcW w:w="1984" w:type="dxa"/>
           </w:tcPr>
           <w:p>
             <w:pPr>
@@ -8122,7 +8126,7 @@
         </w:tc>
         <w:tc>
           <w:tcPr>
-            <w:tcW w:w="0" w:type="auto"/>
+            <w:tcW w:w="1276" w:type="dxa"/>
           </w:tcPr>
           <w:p>
             <w:pPr>
@@ -8151,7 +8155,7 @@
         </w:tc>
         <w:tc>
           <w:tcPr>
-            <w:tcW w:w="0" w:type="auto"/>
+            <w:tcW w:w="3551" w:type="dxa"/>
           </w:tcPr>
           <w:p>
             <w:pPr>
@@ -8270,7 +8274,7 @@
         </w:trPr>
         <w:tc>
           <w:tcPr>
-            <w:tcW w:w="0" w:type="auto"/>
+            <w:tcW w:w="1980" w:type="dxa"/>
           </w:tcPr>
           <w:p>
             <w:pPr>
@@ -8297,7 +8301,7 @@
         </w:tc>
         <w:tc>
           <w:tcPr>
-            <w:tcW w:w="0" w:type="auto"/>
+            <w:tcW w:w="1984" w:type="dxa"/>
           </w:tcPr>
           <w:p>
             <w:pPr>
@@ -8325,7 +8329,7 @@
         </w:tc>
         <w:tc>
           <w:tcPr>
-            <w:tcW w:w="0" w:type="auto"/>
+            <w:tcW w:w="1276" w:type="dxa"/>
           </w:tcPr>
           <w:p>
             <w:pPr>
@@ -8347,7 +8351,7 @@
         </w:tc>
         <w:tc>
           <w:tcPr>
-            <w:tcW w:w="0" w:type="auto"/>
+            <w:tcW w:w="3551" w:type="dxa"/>
           </w:tcPr>
           <w:p>
             <w:pPr>
@@ -8440,7 +8444,7 @@
         </w:trPr>
         <w:tc>
           <w:tcPr>
-            <w:tcW w:w="0" w:type="auto"/>
+            <w:tcW w:w="1980" w:type="dxa"/>
           </w:tcPr>
           <w:p>
             <w:pPr>
@@ -8460,7 +8464,7 @@
         </w:tc>
         <w:tc>
           <w:tcPr>
-            <w:tcW w:w="0" w:type="auto"/>
+            <w:tcW w:w="1984" w:type="dxa"/>
           </w:tcPr>
           <w:p>
             <w:pPr>
@@ -8488,7 +8492,7 @@
         </w:tc>
         <w:tc>
           <w:tcPr>
-            <w:tcW w:w="0" w:type="auto"/>
+            <w:tcW w:w="1276" w:type="dxa"/>
           </w:tcPr>
           <w:p>
             <w:pPr>
@@ -8508,7 +8512,7 @@
         </w:tc>
         <w:tc>
           <w:tcPr>
-            <w:tcW w:w="0" w:type="auto"/>
+            <w:tcW w:w="3551" w:type="dxa"/>
           </w:tcPr>
           <w:p>
             <w:pPr>
@@ -8550,7 +8554,7 @@
         </w:trPr>
         <w:tc>
           <w:tcPr>
-            <w:tcW w:w="0" w:type="auto"/>
+            <w:tcW w:w="1980" w:type="dxa"/>
           </w:tcPr>
           <w:p>
             <w:pPr>
@@ -8584,7 +8588,7 @@
         </w:tc>
         <w:tc>
           <w:tcPr>
-            <w:tcW w:w="0" w:type="auto"/>
+            <w:tcW w:w="1984" w:type="dxa"/>
           </w:tcPr>
           <w:p>
             <w:pPr>
@@ -8607,7 +8611,7 @@
         </w:tc>
         <w:tc>
           <w:tcPr>
-            <w:tcW w:w="0" w:type="auto"/>
+            <w:tcW w:w="1276" w:type="dxa"/>
           </w:tcPr>
           <w:p>
             <w:pPr>
@@ -8636,7 +8640,7 @@
         </w:tc>
         <w:tc>
           <w:tcPr>
-            <w:tcW w:w="0" w:type="auto"/>
+            <w:tcW w:w="3551" w:type="dxa"/>
           </w:tcPr>
           <w:p>
             <w:pPr>
@@ -38635,6 +38639,7 @@
       <w:tr>
         <w:trPr>
           <w:cnfStyle w:val="000000100000" w:firstRow="0" w:lastRow="0" w:firstColumn="0" w:lastColumn="0" w:oddVBand="0" w:evenVBand="0" w:oddHBand="1" w:evenHBand="0" w:firstRowFirstColumn="0" w:firstRowLastColumn="0" w:lastRowFirstColumn="0" w:lastRowLastColumn="0"/>
+          <w:trHeight w:val="658"/>
         </w:trPr>
         <w:tc>
           <w:tcPr>
@@ -46645,13 +46650,11 @@
         <w:gridCol w:w="936"/>
         <w:gridCol w:w="627"/>
         <w:gridCol w:w="1126"/>
-        <w:gridCol w:w="3733"/>
-        <w:gridCol w:w="3264"/>
+        <w:gridCol w:w="6997"/>
         <w:gridCol w:w="1077"/>
       </w:tblGrid>
       <w:tr>
         <w:trPr>
-          <w:gridAfter w:val="1"/>
           <w:cantSplit/>
           <w:jc w:val="center"/>
         </w:trPr>
@@ -46840,7 +46843,6 @@
         <w:tc>
           <w:tcPr>
             <w:tcW w:w="0" w:type="auto"/>
-            <w:gridSpan w:val="2"/>
           </w:tcPr>
           <w:p>
             <w:pPr>
@@ -46880,6 +46882,7 @@
           </w:p>
           <w:p>
             <w:pPr>
+              <w:jc w:val="left"/>
               <w:rPr>
                 <w:sz w:val="18"/>
                 <w:szCs w:val="18"/>
@@ -47484,8 +47487,11 @@
       </w:r>
     </w:p>
     <w:p/>
-    <w:p/>
     <w:p>
+      <w:pPr>
+        <w:keepNext/>
+        <w:keepLines/>
+      </w:pPr>
       <w:r>
         <w:rPr>
           <w:noProof/>
@@ -47548,6 +47554,8 @@
     <w:p>
       <w:pPr>
         <w:pStyle w:val="Caption"/>
+        <w:keepNext/>
+        <w:keepLines/>
       </w:pPr>
       <w:bookmarkStart w:id="29" w:name="_Ref230869364"/>
       <w:r>
@@ -50909,7 +50917,6 @@
         <w:t>.</w:t>
       </w:r>
     </w:p>
-    <w:p/>
     <w:p>
       <w:r>
         <w:t>Each "Scopes" attribute shall contain zero or more "Scope" attributes.</w:t>
@@ -51179,7 +51186,6 @@
     </w:p>
     <w:p>
       <w:r>
-        <w:lastRenderedPageBreak/>
         <w:t xml:space="preserve">Note: Equivalent provisions also apply to the </w:t>
       </w:r>
       <w:r>
@@ -51268,7 +51274,7 @@
     <w:tbl>
       <w:tblPr>
         <w:tblW w:w="0" w:type="auto"/>
-        <w:tblInd w:w="630" w:type="dxa"/>
+        <w:tblInd w:w="421" w:type="dxa"/>
         <w:tblBorders>
           <w:top w:val="single" w:sz="4" w:space="0" w:color="auto"/>
           <w:left w:val="single" w:sz="4" w:space="0" w:color="auto"/>
@@ -51280,7 +51286,7 @@
         <w:tblLook w:val="0000" w:firstRow="0" w:lastRow="0" w:firstColumn="0" w:lastColumn="0" w:noHBand="0" w:noVBand="0"/>
       </w:tblPr>
       <w:tblGrid>
-        <w:gridCol w:w="7125"/>
+        <w:gridCol w:w="7334"/>
       </w:tblGrid>
       <w:tr>
         <w:trPr>
@@ -51288,7 +51294,7 @@
         </w:trPr>
         <w:tc>
           <w:tcPr>
-            <w:tcW w:w="7125" w:type="dxa"/>
+            <w:tcW w:w="7334" w:type="dxa"/>
           </w:tcPr>
           <w:p>
             <w:pPr>
@@ -51432,8 +51438,8 @@
     </w:p>
     <w:tbl>
       <w:tblPr>
-        <w:tblW w:w="10431" w:type="dxa"/>
-        <w:tblInd w:w="542" w:type="dxa"/>
+        <w:tblW w:w="10552" w:type="dxa"/>
+        <w:tblInd w:w="421" w:type="dxa"/>
         <w:tblBorders>
           <w:top w:val="single" w:sz="4" w:space="0" w:color="auto"/>
           <w:left w:val="single" w:sz="4" w:space="0" w:color="auto"/>
@@ -51445,7 +51451,7 @@
         <w:tblLook w:val="0000" w:firstRow="0" w:lastRow="0" w:firstColumn="0" w:lastColumn="0" w:noHBand="0" w:noVBand="0"/>
       </w:tblPr>
       <w:tblGrid>
-        <w:gridCol w:w="10431"/>
+        <w:gridCol w:w="10552"/>
       </w:tblGrid>
       <w:tr>
         <w:trPr>
@@ -51453,7 +51459,7 @@
         </w:trPr>
         <w:tc>
           <w:tcPr>
-            <w:tcW w:w="10431" w:type="dxa"/>
+            <w:tcW w:w="10552" w:type="dxa"/>
           </w:tcPr>
           <w:p>
             <w:pPr>
@@ -51863,8 +51869,8 @@
     <w:p/>
     <w:tbl>
       <w:tblPr>
-        <w:tblW w:w="10418" w:type="dxa"/>
-        <w:tblInd w:w="542" w:type="dxa"/>
+        <w:tblW w:w="10539" w:type="dxa"/>
+        <w:tblInd w:w="421" w:type="dxa"/>
         <w:tblBorders>
           <w:top w:val="single" w:sz="4" w:space="0" w:color="auto"/>
           <w:left w:val="single" w:sz="4" w:space="0" w:color="auto"/>
@@ -51876,7 +51882,7 @@
         <w:tblLook w:val="0000" w:firstRow="0" w:lastRow="0" w:firstColumn="0" w:lastColumn="0" w:noHBand="0" w:noVBand="0"/>
       </w:tblPr>
       <w:tblGrid>
-        <w:gridCol w:w="10418"/>
+        <w:gridCol w:w="10539"/>
       </w:tblGrid>
       <w:tr>
         <w:trPr>
@@ -51884,7 +51890,7 @@
         </w:trPr>
         <w:tc>
           <w:tcPr>
-            <w:tcW w:w="10418" w:type="dxa"/>
+            <w:tcW w:w="10539" w:type="dxa"/>
           </w:tcPr>
           <w:p>
             <w:pPr>
@@ -51997,7 +52003,6 @@
             <w:pPr>
               <w:keepNext/>
               <w:keepLines/>
-              <w:ind w:firstLine="720"/>
             </w:pPr>
             <w:r>
               <w:t xml:space="preserve">The </w:t>
@@ -52020,7 +52025,6 @@
             <w:pPr>
               <w:keepNext/>
               <w:keepLines/>
-              <w:ind w:firstLine="720"/>
               <w:rPr>
                 <w:i/>
                 <w:iCs/>

</xml_diff>